<commit_message>
Met a jour la notice d'insertion (palette de couleurs beige selon la version Drive du 02/06)
Co-Authored-By: Claude Sonnet 4.6 <noreply@anthropic.com>
</commit_message>
<xml_diff>
--- a/files/pro/notice/notice-insertion.docx
+++ b/files/pro/notice/notice-insertion.docx
@@ -7226,7 +7226,7 @@
           <w:szCs w:val="21"/>
           <w:rtl w:val="0"/>
         </w:rPr>
-        <w:t xml:space="preserve">Les menuiseries extérieures seront en aluminium thermolaqué à rupture de pont thermique, de marque TECHNAL, SCHÜCO ou REYNAERS. La couleur sera choisie dans une gamme de gris anthracite ou bronze, en contraste élégant avec les façades claires. Les garde-corps seront en acier thermolaqué ou aluminium, avec remplissage en verre feuilleté ou panneaux aluminium perforés.</w:t>
+        <w:t xml:space="preserve">Les menuiseries extérieures seront en aluminium thermolaqué à rupture de pont thermique, de marque TECHNAL, SCHÜCO ou REYNAERS. La couleur sera choisie dans une gamme de beige, en contraste élégant avec les façades claires. Les garde-corps seront en acier thermolaqué ou aluminium, panneaux perforés feuilleté.</w:t>
       </w:r>
       <w:r>
         <w:rPr>
@@ -7478,7 +7478,7 @@
           <w:vertAlign w:val="baseline"/>
           <w:rtl w:val="0"/>
         </w:rPr>
-        <w:t xml:space="preserve">Terrasses privatives : carrelage grès cérame extérieur antidérapant (R11), finition bois ou pierre</w:t>
+        <w:t xml:space="preserve">Terrasses privatives : carrelage grès cérame extérieur antidérapant (R11), finition pierre</w:t>
       </w:r>
       <w:r>
         <w:rPr>
@@ -8136,7 +8136,7 @@
                 <w:szCs w:val="19"/>
                 <w:rtl w:val="0"/>
               </w:rPr>
-              <w:t xml:space="preserve">Noir</w:t>
+              <w:t xml:space="preserve">Beige</w:t>
             </w:r>
             <w:r>
               <w:rPr>
@@ -8253,7 +8253,7 @@
                 <w:szCs w:val="19"/>
                 <w:rtl w:val="0"/>
               </w:rPr>
-              <w:t xml:space="preserve">Gris anthracite / Verre</w:t>
+              <w:t xml:space="preserve">Beige</w:t>
             </w:r>
             <w:r>
               <w:rPr>
@@ -8370,7 +8370,7 @@
                 <w:szCs w:val="19"/>
                 <w:rtl w:val="0"/>
               </w:rPr>
-              <w:t xml:space="preserve">Gris anthracite</w:t>
+              <w:t xml:space="preserve">Beige</w:t>
             </w:r>
             <w:r>
               <w:rPr>
@@ -8602,7 +8602,7 @@
                 <w:szCs w:val="19"/>
                 <w:rtl w:val="0"/>
               </w:rPr>
-              <w:t xml:space="preserve">Blanc cassé / Terre cuite </w:t>
+              <w:t xml:space="preserve">Terre cuite </w:t>
             </w:r>
             <w:r>
               <w:rPr>

</xml_diff>